<commit_message>
Rebuild NMJI submission package and publish repo assets
</commit_message>
<xml_diff>
--- a/outputs/publication/00_title_page.docx
+++ b/outputs/publication/00_title_page.docx
@@ -4,13 +4,7 @@
   <w:body>
     <w:p>
       <w:pPr>
-        <w:spacing w:before="0" w:after="120"/>
-        <w:jc w:val="left"/>
-      </w:pPr>
-    </w:p>
-    <w:p>
-      <w:pPr>
-        <w:spacing w:before="0" w:after="360"/>
+        <w:spacing w:after="280"/>
         <w:jc w:val="center"/>
       </w:pPr>
       <w:r>
@@ -20,12 +14,12 @@
           <w:i w:val="0"/>
           <w:sz w:val="28"/>
         </w:rPr>
-        <w:t>BURDEN OF INJURIES IN INDIA: A STATE-LEVEL ANALYSIS OF DISABILITY-ADJUSTED LIFE YEARS, MORTALITY PATTERNS, AND ADMINISTRATIVE DATA ALIGNMENT USING GBD 2023 AND NATIONAL SURVEILLANCE SOURCES</w:t>
+        <w:t>Burden of injuries in India from a public health perspective: state-level fatal-non-fatal decomposition, inequality, and surveillance-burden mismatch using GBD 2021 and official Indian secondary data</w:t>
       </w:r>
     </w:p>
     <w:p>
       <w:pPr>
-        <w:spacing w:before="0" w:after="360"/>
+        <w:spacing w:after="120"/>
         <w:jc w:val="center"/>
       </w:pPr>
       <w:r>
@@ -35,27 +29,12 @@
           <w:i/>
           <w:sz w:val="22"/>
         </w:rPr>
-        <w:t>Running title: State-level injury burden in India</w:t>
+        <w:t>Short title: State-level injury burden in India</w:t>
       </w:r>
     </w:p>
     <w:p>
       <w:pPr>
-        <w:spacing w:before="0" w:after="120"/>
-        <w:jc w:val="center"/>
-      </w:pPr>
-      <w:r>
-        <w:rPr>
-          <w:rFonts w:ascii="Times New Roman" w:hAnsi="Times New Roman"/>
-          <w:b/>
-          <w:i w:val="0"/>
-          <w:sz w:val="24"/>
-        </w:rPr>
-        <w:t>Authors:</w:t>
-      </w:r>
-    </w:p>
-    <w:p>
-      <w:pPr>
-        <w:spacing w:before="0" w:after="240"/>
+        <w:spacing w:after="160"/>
         <w:jc w:val="center"/>
       </w:pPr>
       <w:r>
@@ -65,12 +44,27 @@
           <w:i w:val="0"/>
           <w:sz w:val="24"/>
         </w:rPr>
-        <w:t>[Author 1 Name]¹, [Author 2 Name]², [Author 3 Name]¹</w:t>
+        <w:t>Siddalingaiah H S¹</w:t>
       </w:r>
     </w:p>
     <w:p>
       <w:pPr>
-        <w:spacing w:before="0" w:after="120"/>
+        <w:spacing w:after="280"/>
+        <w:jc w:val="center"/>
+      </w:pPr>
+      <w:r>
+        <w:rPr>
+          <w:rFonts w:ascii="Times New Roman" w:hAnsi="Times New Roman"/>
+          <w:b w:val="0"/>
+          <w:i w:val="0"/>
+          <w:sz w:val="22"/>
+        </w:rPr>
+        <w:t>¹ Department of Community Medicine, Shridevi Institute of Medical Sciences and Research Hospital, Tumkur, Karnataka, India</w:t>
+      </w:r>
+    </w:p>
+    <w:p>
+      <w:pPr>
+        <w:spacing w:after="120"/>
         <w:jc w:val="left"/>
       </w:pPr>
       <w:r>
@@ -80,12 +74,12 @@
           <w:i w:val="0"/>
           <w:sz w:val="22"/>
         </w:rPr>
-        <w:t>Affiliations:</w:t>
+        <w:t>Corresponding author</w:t>
       </w:r>
     </w:p>
     <w:p>
       <w:pPr>
-        <w:spacing w:before="0" w:after="80"/>
+        <w:spacing w:after="120"/>
         <w:jc w:val="left"/>
       </w:pPr>
       <w:r>
@@ -95,12 +89,20 @@
           <w:i w:val="0"/>
           <w:sz w:val="22"/>
         </w:rPr>
-        <w:t>¹ Department of Community Medicine, [Institution], [City], India</w:t>
+        <w:t>Siddalingaiah H S</w:t>
+        <w:br/>
+        <w:t>Shridevi Institute of Medical Sciences and Research Hospital, Tumkur, Karnataka, India</w:t>
+        <w:br/>
+        <w:t>Email: hssling@yahoo.com</w:t>
+        <w:br/>
+        <w:t>Phone: +91 8941087719</w:t>
+        <w:br/>
+        <w:t>ORCID: 0000-0002-4771-8285</w:t>
       </w:r>
     </w:p>
     <w:p>
       <w:pPr>
-        <w:spacing w:before="0" w:after="320"/>
+        <w:spacing w:after="120"/>
         <w:jc w:val="left"/>
       </w:pPr>
       <w:r>
@@ -110,27 +112,12 @@
           <w:i w:val="0"/>
           <w:sz w:val="22"/>
         </w:rPr>
-        <w:t>² Department of Epidemiology, [Institution], [City], India</w:t>
+        <w:t>Article type: Original article</w:t>
       </w:r>
     </w:p>
     <w:p>
       <w:pPr>
-        <w:spacing w:before="0" w:after="120"/>
-        <w:jc w:val="left"/>
-      </w:pPr>
-      <w:r>
-        <w:rPr>
-          <w:rFonts w:ascii="Times New Roman" w:hAnsi="Times New Roman"/>
-          <w:b/>
-          <w:i w:val="0"/>
-          <w:sz w:val="22"/>
-        </w:rPr>
-        <w:t>Corresponding author:</w:t>
-      </w:r>
-    </w:p>
-    <w:p>
-      <w:pPr>
-        <w:spacing w:before="0" w:after="320"/>
+        <w:spacing w:after="120"/>
         <w:jc w:val="left"/>
       </w:pPr>
       <w:r>
@@ -140,29 +127,12 @@
           <w:i w:val="0"/>
           <w:sz w:val="22"/>
         </w:rPr>
-        <w:t>[Author Name], [Address], [City – PIN], India</w:t>
-        <w:br/>
-        <w:t>Email: [email@institution.ac.in]  |  Phone: [+91-XXXXXXXXXX]</w:t>
+        <w:t>Word count: Abstract ~280 words; main text ~1800 words</w:t>
       </w:r>
     </w:p>
     <w:p>
       <w:pPr>
-        <w:spacing w:before="0" w:after="120"/>
-        <w:jc w:val="left"/>
-      </w:pPr>
-      <w:r>
-        <w:rPr>
-          <w:rFonts w:ascii="Times New Roman" w:hAnsi="Times New Roman"/>
-          <w:b/>
-          <w:i w:val="0"/>
-          <w:sz w:val="22"/>
-        </w:rPr>
-        <w:t>Word count (main text):</w:t>
-      </w:r>
-    </w:p>
-    <w:p>
-      <w:pPr>
-        <w:spacing w:before="0" w:after="240"/>
+        <w:spacing w:after="120"/>
         <w:jc w:val="left"/>
       </w:pPr>
       <w:r>
@@ -172,12 +142,12 @@
           <w:i w:val="0"/>
           <w:sz w:val="22"/>
         </w:rPr>
-        <w:t>Approximately 3,500 words (within NMJI Original Article limit)</w:t>
+        <w:t>Main display items: 3 tables and 2 figures</w:t>
       </w:r>
     </w:p>
     <w:p>
       <w:pPr>
-        <w:spacing w:before="0" w:after="120"/>
+        <w:spacing w:after="120"/>
         <w:jc w:val="left"/>
       </w:pPr>
       <w:r>
@@ -187,12 +157,12 @@
           <w:i w:val="0"/>
           <w:sz w:val="22"/>
         </w:rPr>
-        <w:t>Tables: 4 (main) + 2 (supplementary)</w:t>
+        <w:t>Supplementary items: 3 tables and 4 figures</w:t>
       </w:r>
     </w:p>
     <w:p>
       <w:pPr>
-        <w:spacing w:before="0" w:after="120"/>
+        <w:spacing w:after="120"/>
         <w:jc w:val="left"/>
       </w:pPr>
       <w:r>
@@ -202,12 +172,12 @@
           <w:i w:val="0"/>
           <w:sz w:val="22"/>
         </w:rPr>
-        <w:t>Figures: 7 (main) + 1 (supplementary)</w:t>
+        <w:t>Funding: None</w:t>
       </w:r>
     </w:p>
     <w:p>
       <w:pPr>
-        <w:spacing w:before="0" w:after="240"/>
+        <w:spacing w:after="120"/>
         <w:jc w:val="left"/>
       </w:pPr>
       <w:r>
@@ -217,12 +187,12 @@
           <w:i w:val="0"/>
           <w:sz w:val="22"/>
         </w:rPr>
-        <w:t>References: 30</w:t>
+        <w:t>Conflicts of interest: None declared</w:t>
       </w:r>
     </w:p>
     <w:p>
       <w:pPr>
-        <w:spacing w:before="0" w:after="120"/>
+        <w:spacing w:after="120"/>
         <w:jc w:val="left"/>
       </w:pPr>
       <w:r>
@@ -232,42 +202,12 @@
           <w:i w:val="0"/>
           <w:sz w:val="22"/>
         </w:rPr>
-        <w:t>Conflicts of interest: None declared.</w:t>
+        <w:t>Data and code availability: https://github.com/hssling/injury-india-public-health</w:t>
       </w:r>
     </w:p>
     <w:p>
       <w:pPr>
-        <w:spacing w:before="0" w:after="120"/>
-        <w:jc w:val="left"/>
-      </w:pPr>
-      <w:r>
-        <w:rPr>
-          <w:rFonts w:ascii="Times New Roman" w:hAnsi="Times New Roman"/>
-          <w:b w:val="0"/>
-          <w:i w:val="0"/>
-          <w:sz w:val="22"/>
-        </w:rPr>
-        <w:t>Funding: None.</w:t>
-      </w:r>
-    </w:p>
-    <w:p>
-      <w:pPr>
-        <w:spacing w:before="0" w:after="240"/>
-        <w:jc w:val="left"/>
-      </w:pPr>
-      <w:r>
-        <w:rPr>
-          <w:rFonts w:ascii="Times New Roman" w:hAnsi="Times New Roman"/>
-          <w:b w:val="0"/>
-          <w:i w:val="0"/>
-          <w:sz w:val="22"/>
-        </w:rPr>
-        <w:t>Data availability: All analysis code and processed datasets available at https://github.com/[repository] under a CC-BY 4.0 licence.</w:t>
-      </w:r>
-    </w:p>
-    <w:p>
-      <w:pPr>
-        <w:spacing w:before="0" w:after="120"/>
+        <w:spacing w:after="120"/>
         <w:jc w:val="left"/>
       </w:pPr>
       <w:r>
@@ -280,24 +220,9 @@
         <w:t>Submission date: 24 April 2026</w:t>
       </w:r>
     </w:p>
-    <w:p>
-      <w:pPr>
-        <w:spacing w:before="0" w:after="120"/>
-        <w:jc w:val="left"/>
-      </w:pPr>
-      <w:r>
-        <w:rPr>
-          <w:rFonts w:ascii="Times New Roman" w:hAnsi="Times New Roman"/>
-          <w:b w:val="0"/>
-          <w:i w:val="0"/>
-          <w:sz w:val="22"/>
-        </w:rPr>
-        <w:t>Submission to: National Medical Journal of India</w:t>
-      </w:r>
-    </w:p>
     <w:sectPr>
       <w:pgSz w:w="12240" w:h="15840"/>
-      <w:pgMar w:top="1417" w:right="1417" w:bottom="1417" w:left="1701" w:header="720" w:footer="720" w:gutter="0"/>
+      <w:pgMar w:top="1440" w:right="1440" w:bottom="1440" w:left="1440" w:header="720" w:footer="720" w:gutter="0"/>
       <w:cols w:space="720"/>
       <w:docGrid w:linePitch="360"/>
     </w:sectPr>

</xml_diff>

<commit_message>
Restore full manuscript content and citation order
</commit_message>
<xml_diff>
--- a/outputs/publication/00_title_page.docx
+++ b/outputs/publication/00_title_page.docx
@@ -4,7 +4,7 @@
   <w:body>
     <w:p>
       <w:pPr>
-        <w:spacing w:after="280"/>
+        <w:spacing w:before="0" w:after="320"/>
         <w:jc w:val="center"/>
       </w:pPr>
       <w:r>
@@ -19,7 +19,7 @@
     </w:p>
     <w:p>
       <w:pPr>
-        <w:spacing w:after="120"/>
+        <w:spacing w:before="0" w:after="120"/>
         <w:jc w:val="center"/>
       </w:pPr>
       <w:r>
@@ -34,7 +34,6 @@
     </w:p>
     <w:p>
       <w:pPr>
-        <w:spacing w:after="160"/>
         <w:jc w:val="center"/>
       </w:pPr>
       <w:r>
@@ -44,12 +43,21 @@
           <w:i w:val="0"/>
           <w:sz w:val="24"/>
         </w:rPr>
-        <w:t>Siddalingaiah H S¹</w:t>
+        <w:t>Siddalingaiah H S</w:t>
+      </w:r>
+      <w:r>
+        <w:rPr>
+          <w:rFonts w:ascii="Times New Roman" w:hAnsi="Times New Roman"/>
+          <w:b w:val="0"/>
+          <w:i w:val="0"/>
+          <w:sz w:val="18"/>
+          <w:vertAlign w:val="superscript"/>
+        </w:rPr>
+        <w:t>1</w:t>
       </w:r>
     </w:p>
     <w:p>
       <w:pPr>
-        <w:spacing w:after="280"/>
         <w:jc w:val="center"/>
       </w:pPr>
       <w:r>
@@ -57,14 +65,24 @@
           <w:rFonts w:ascii="Times New Roman" w:hAnsi="Times New Roman"/>
           <w:b w:val="0"/>
           <w:i w:val="0"/>
+          <w:sz w:val="18"/>
+          <w:vertAlign w:val="superscript"/>
+        </w:rPr>
+        <w:t xml:space="preserve">1 </w:t>
+      </w:r>
+      <w:r>
+        <w:rPr>
+          <w:rFonts w:ascii="Times New Roman" w:hAnsi="Times New Roman"/>
+          <w:b w:val="0"/>
+          <w:i w:val="0"/>
           <w:sz w:val="22"/>
         </w:rPr>
-        <w:t>¹ Department of Community Medicine, Shridevi Institute of Medical Sciences and Research Hospital, Tumkur, Karnataka, India</w:t>
+        <w:t>Department of Community Medicine, Shridevi Institute of Medical Sciences and Research Hospital, Tumkur, Karnataka, India</w:t>
       </w:r>
     </w:p>
     <w:p>
       <w:pPr>
-        <w:spacing w:after="120"/>
+        <w:spacing w:before="160" w:after="120"/>
         <w:jc w:val="left"/>
       </w:pPr>
       <w:r>
@@ -79,7 +97,7 @@
     </w:p>
     <w:p>
       <w:pPr>
-        <w:spacing w:after="120"/>
+        <w:spacing w:before="0" w:after="120"/>
         <w:jc w:val="left"/>
       </w:pPr>
       <w:r>
@@ -102,7 +120,7 @@
     </w:p>
     <w:p>
       <w:pPr>
-        <w:spacing w:after="120"/>
+        <w:spacing w:before="0" w:after="120"/>
         <w:jc w:val="left"/>
       </w:pPr>
       <w:r>
@@ -117,7 +135,7 @@
     </w:p>
     <w:p>
       <w:pPr>
-        <w:spacing w:after="120"/>
+        <w:spacing w:before="0" w:after="120"/>
         <w:jc w:val="left"/>
       </w:pPr>
       <w:r>
@@ -127,12 +145,12 @@
           <w:i w:val="0"/>
           <w:sz w:val="22"/>
         </w:rPr>
-        <w:t>Word count: Abstract ~280 words; main text ~1800 words</w:t>
+        <w:t>Word count: Abstract ~290 words; main text ~3200 words</w:t>
       </w:r>
     </w:p>
     <w:p>
       <w:pPr>
-        <w:spacing w:after="120"/>
+        <w:spacing w:before="0" w:after="120"/>
         <w:jc w:val="left"/>
       </w:pPr>
       <w:r>
@@ -142,12 +160,12 @@
           <w:i w:val="0"/>
           <w:sz w:val="22"/>
         </w:rPr>
-        <w:t>Main display items: 3 tables and 2 figures</w:t>
+        <w:t>Tables: 4 main</w:t>
       </w:r>
     </w:p>
     <w:p>
       <w:pPr>
-        <w:spacing w:after="120"/>
+        <w:spacing w:before="0" w:after="120"/>
         <w:jc w:val="left"/>
       </w:pPr>
       <w:r>
@@ -157,12 +175,42 @@
           <w:i w:val="0"/>
           <w:sz w:val="22"/>
         </w:rPr>
-        <w:t>Supplementary items: 3 tables and 4 figures</w:t>
+        <w:t>Figures: 6</w:t>
       </w:r>
     </w:p>
     <w:p>
       <w:pPr>
-        <w:spacing w:after="120"/>
+        <w:spacing w:before="0" w:after="120"/>
+        <w:jc w:val="left"/>
+      </w:pPr>
+      <w:r>
+        <w:rPr>
+          <w:rFonts w:ascii="Times New Roman" w:hAnsi="Times New Roman"/>
+          <w:b w:val="0"/>
+          <w:i w:val="0"/>
+          <w:sz w:val="22"/>
+        </w:rPr>
+        <w:t>Supplementary tables: 4</w:t>
+      </w:r>
+    </w:p>
+    <w:p>
+      <w:pPr>
+        <w:spacing w:before="0" w:after="120"/>
+        <w:jc w:val="left"/>
+      </w:pPr>
+      <w:r>
+        <w:rPr>
+          <w:rFonts w:ascii="Times New Roman" w:hAnsi="Times New Roman"/>
+          <w:b w:val="0"/>
+          <w:i w:val="0"/>
+          <w:sz w:val="22"/>
+        </w:rPr>
+        <w:t>References: 20</w:t>
+      </w:r>
+    </w:p>
+    <w:p>
+      <w:pPr>
+        <w:spacing w:before="0" w:after="120"/>
         <w:jc w:val="left"/>
       </w:pPr>
       <w:r>
@@ -177,7 +225,7 @@
     </w:p>
     <w:p>
       <w:pPr>
-        <w:spacing w:after="120"/>
+        <w:spacing w:before="0" w:after="120"/>
         <w:jc w:val="left"/>
       </w:pPr>
       <w:r>
@@ -192,7 +240,7 @@
     </w:p>
     <w:p>
       <w:pPr>
-        <w:spacing w:after="120"/>
+        <w:spacing w:before="0" w:after="120"/>
         <w:jc w:val="left"/>
       </w:pPr>
       <w:r>
@@ -207,7 +255,7 @@
     </w:p>
     <w:p>
       <w:pPr>
-        <w:spacing w:after="120"/>
+        <w:spacing w:before="0" w:after="120"/>
         <w:jc w:val="left"/>
       </w:pPr>
       <w:r>

</xml_diff>